<commit_message>
Korjasin pari asiaa ohjelmadokumentissa
</commit_message>
<xml_diff>
--- a/Design Document.docx
+++ b/Design Document.docx
@@ -7,32 +7,18 @@
         <w:pStyle w:val="Otsikko1"/>
         <w:ind w:left="2608"/>
         <w:rPr>
+          <w:b/>
+          <w:bCs/>
           <w:color w:val="auto"/>
         </w:rPr>
       </w:pPr>
       <w:r>
         <w:rPr>
+          <w:b/>
+          <w:bCs/>
           <w:color w:val="auto"/>
         </w:rPr>
-        <w:t xml:space="preserve">Design </w:t>
-      </w:r>
-      <w:r>
-        <w:rPr>
-          <w:color w:val="auto"/>
-        </w:rPr>
-        <w:t>Do</w:t>
-      </w:r>
-      <w:r>
-        <w:rPr>
-          <w:color w:val="auto"/>
-        </w:rPr>
-        <w:t>c</w:t>
-      </w:r>
-      <w:r>
-        <w:rPr>
-          <w:color w:val="auto"/>
-        </w:rPr>
-        <w:t>ument</w:t>
+        <w:t>Ohjelmadokumentti</w:t>
       </w:r>
     </w:p>
     <w:p>
@@ -52,11 +38,15 @@
         </w:numPr>
         <w:rPr>
           <w:rFonts w:ascii="Arial" w:hAnsi="Arial" w:cs="Arial"/>
-        </w:rPr>
-      </w:pPr>
-      <w:r>
-        <w:rPr>
-          <w:rFonts w:ascii="Arial" w:hAnsi="Arial" w:cs="Arial"/>
+          <w:b/>
+          <w:bCs/>
+        </w:rPr>
+      </w:pPr>
+      <w:r>
+        <w:rPr>
+          <w:rFonts w:ascii="Arial" w:hAnsi="Arial" w:cs="Arial"/>
+          <w:b/>
+          <w:bCs/>
         </w:rPr>
         <w:t>Kuvaus</w:t>
       </w:r>
@@ -151,18 +141,30 @@
         <w:rPr>
           <w:rFonts w:ascii="Arial" w:hAnsi="Arial" w:cs="Arial"/>
         </w:rPr>
-        <w:t xml:space="preserve"> tietokone ja komponentti varastossa.</w:t>
-      </w:r>
-      <w:r>
-        <w:rPr>
-          <w:rFonts w:ascii="Arial" w:hAnsi="Arial" w:cs="Arial"/>
-        </w:rPr>
         <w:t xml:space="preserve"> </w:t>
       </w:r>
       <w:r>
         <w:rPr>
           <w:rFonts w:ascii="Arial" w:hAnsi="Arial" w:cs="Arial"/>
         </w:rPr>
+        <w:t>varastossa olevia tietokoneita ja komponentteja</w:t>
+      </w:r>
+      <w:r>
+        <w:rPr>
+          <w:rFonts w:ascii="Arial" w:hAnsi="Arial" w:cs="Arial"/>
+        </w:rPr>
+        <w:t>.</w:t>
+      </w:r>
+      <w:r>
+        <w:rPr>
+          <w:rFonts w:ascii="Arial" w:hAnsi="Arial" w:cs="Arial"/>
+        </w:rPr>
+        <w:t xml:space="preserve"> </w:t>
+      </w:r>
+      <w:r>
+        <w:rPr>
+          <w:rFonts w:ascii="Arial" w:hAnsi="Arial" w:cs="Arial"/>
+        </w:rPr>
         <w:t xml:space="preserve">Sovelluksella voi </w:t>
       </w:r>
       <w:r>
@@ -175,7 +177,7 @@
         <w:rPr>
           <w:rFonts w:ascii="Arial" w:hAnsi="Arial" w:cs="Arial"/>
         </w:rPr>
-        <w:t>,</w:t>
+        <w:t xml:space="preserve"> ja</w:t>
       </w:r>
       <w:r>
         <w:rPr>
@@ -187,7 +189,13 @@
         <w:rPr>
           <w:rFonts w:ascii="Arial" w:hAnsi="Arial" w:cs="Arial"/>
         </w:rPr>
-        <w:t>poista,</w:t>
+        <w:t>poista</w:t>
+      </w:r>
+      <w:r>
+        <w:rPr>
+          <w:rFonts w:ascii="Arial" w:hAnsi="Arial" w:cs="Arial"/>
+        </w:rPr>
+        <w:t>a tuotteita, sekä</w:t>
       </w:r>
       <w:r>
         <w:rPr>
@@ -199,37 +207,121 @@
         <w:rPr>
           <w:rFonts w:ascii="Arial" w:hAnsi="Arial" w:cs="Arial"/>
         </w:rPr>
-        <w:t xml:space="preserve">päivitä </w:t>
-      </w:r>
-      <w:r>
-        <w:rPr>
-          <w:rFonts w:ascii="Arial" w:hAnsi="Arial" w:cs="Arial"/>
-        </w:rPr>
-        <w:t>hinta</w:t>
-      </w:r>
-      <w:r>
-        <w:rPr>
-          <w:rFonts w:ascii="Arial" w:hAnsi="Arial" w:cs="Arial"/>
-        </w:rPr>
-        <w:t xml:space="preserve"> ja </w:t>
-      </w:r>
-      <w:r>
-        <w:rPr>
-          <w:rFonts w:ascii="Arial" w:hAnsi="Arial" w:cs="Arial"/>
-        </w:rPr>
-        <w:t xml:space="preserve">määrä. Sovellus toimii Terminalissa ja käyttää </w:t>
-      </w:r>
-      <w:r>
-        <w:rPr>
-          <w:rFonts w:ascii="Arial" w:hAnsi="Arial" w:cs="Arial"/>
-        </w:rPr>
-        <w:t>tietokanta DB-</w:t>
+        <w:t>päivit</w:t>
+      </w:r>
+      <w:r>
+        <w:rPr>
+          <w:rFonts w:ascii="Arial" w:hAnsi="Arial" w:cs="Arial"/>
+        </w:rPr>
+        <w:t>tä</w:t>
+      </w:r>
+      <w:r>
+        <w:rPr>
+          <w:rFonts w:ascii="Arial" w:hAnsi="Arial" w:cs="Arial"/>
+        </w:rPr>
+        <w:t xml:space="preserve">ä </w:t>
+      </w:r>
+      <w:r>
+        <w:rPr>
+          <w:rFonts w:ascii="Arial" w:hAnsi="Arial" w:cs="Arial"/>
+        </w:rPr>
+        <w:t xml:space="preserve">niiden </w:t>
+      </w:r>
+      <w:r>
+        <w:rPr>
+          <w:rFonts w:ascii="Arial" w:hAnsi="Arial" w:cs="Arial"/>
+        </w:rPr>
+        <w:t>hint</w:t>
+      </w:r>
+      <w:r>
+        <w:rPr>
+          <w:rFonts w:ascii="Arial" w:hAnsi="Arial" w:cs="Arial"/>
+        </w:rPr>
+        <w:t>oja</w:t>
+      </w:r>
+      <w:r>
+        <w:rPr>
+          <w:rFonts w:ascii="Arial" w:hAnsi="Arial" w:cs="Arial"/>
+        </w:rPr>
+        <w:t xml:space="preserve"> </w:t>
+      </w:r>
+      <w:r>
+        <w:rPr>
+          <w:rFonts w:ascii="Arial" w:hAnsi="Arial" w:cs="Arial"/>
+        </w:rPr>
+        <w:t>sekä</w:t>
+      </w:r>
+      <w:r>
+        <w:rPr>
+          <w:rFonts w:ascii="Arial" w:hAnsi="Arial" w:cs="Arial"/>
+        </w:rPr>
+        <w:t xml:space="preserve"> </w:t>
+      </w:r>
+      <w:r>
+        <w:rPr>
+          <w:rFonts w:ascii="Arial" w:hAnsi="Arial" w:cs="Arial"/>
+        </w:rPr>
+        <w:t>määrä</w:t>
+      </w:r>
+      <w:r>
+        <w:rPr>
+          <w:rFonts w:ascii="Arial" w:hAnsi="Arial" w:cs="Arial"/>
+        </w:rPr>
+        <w:t>ä</w:t>
+      </w:r>
+      <w:r>
+        <w:rPr>
+          <w:rFonts w:ascii="Arial" w:hAnsi="Arial" w:cs="Arial"/>
+        </w:rPr>
+        <w:t xml:space="preserve">. Sovellus toimii </w:t>
+      </w:r>
+      <w:r>
+        <w:rPr>
+          <w:rFonts w:ascii="Arial" w:hAnsi="Arial" w:cs="Arial"/>
+        </w:rPr>
+        <w:t>t</w:t>
+      </w:r>
+      <w:r>
+        <w:rPr>
+          <w:rFonts w:ascii="Arial" w:hAnsi="Arial" w:cs="Arial"/>
+        </w:rPr>
+        <w:t>ermina</w:t>
+      </w:r>
+      <w:r>
+        <w:rPr>
+          <w:rFonts w:ascii="Arial" w:hAnsi="Arial" w:cs="Arial"/>
+        </w:rPr>
+        <w:t>a</w:t>
+      </w:r>
+      <w:r>
+        <w:rPr>
+          <w:rFonts w:ascii="Arial" w:hAnsi="Arial" w:cs="Arial"/>
+        </w:rPr>
+        <w:t xml:space="preserve">lissa ja </w:t>
+      </w:r>
+      <w:r>
+        <w:rPr>
+          <w:rFonts w:ascii="Arial" w:hAnsi="Arial" w:cs="Arial"/>
+        </w:rPr>
+        <w:t>sen tietokantaa käytetään</w:t>
+      </w:r>
+      <w:r>
+        <w:rPr>
+          <w:rFonts w:ascii="Arial" w:hAnsi="Arial" w:cs="Arial"/>
+        </w:rPr>
+        <w:t xml:space="preserve"> DB-</w:t>
       </w:r>
       <w:r>
         <w:rPr>
           <w:rFonts w:ascii="Arial" w:hAnsi="Arial" w:cs="Arial"/>
         </w:rPr>
         <w:t>Browser</w:t>
+      </w:r>
+      <w:r>
+        <w:rPr>
+          <w:rFonts w:ascii="Arial" w:hAnsi="Arial" w:cs="Arial"/>
+        </w:rPr>
+        <w:t xml:space="preserve"> ohjelman</w:t>
       </w:r>
       <w:r>
         <w:rPr>
@@ -253,23 +345,31 @@
         </w:numPr>
         <w:rPr>
           <w:rFonts w:ascii="Arial" w:hAnsi="Arial" w:cs="Arial"/>
-        </w:rPr>
-      </w:pPr>
-      <w:r>
-        <w:rPr>
-          <w:rFonts w:ascii="Arial" w:hAnsi="Arial" w:cs="Arial"/>
+          <w:b/>
+          <w:bCs/>
+        </w:rPr>
+      </w:pPr>
+      <w:r>
+        <w:rPr>
+          <w:rFonts w:ascii="Arial" w:hAnsi="Arial" w:cs="Arial"/>
+          <w:b/>
+          <w:bCs/>
         </w:rPr>
         <w:t xml:space="preserve"> </w:t>
       </w:r>
       <w:r>
         <w:rPr>
           <w:rFonts w:ascii="Arial" w:hAnsi="Arial" w:cs="Arial"/>
+          <w:b/>
+          <w:bCs/>
         </w:rPr>
         <w:t>T</w:t>
       </w:r>
       <w:r>
         <w:rPr>
           <w:rFonts w:ascii="Arial" w:hAnsi="Arial" w:cs="Arial"/>
+          <w:b/>
+          <w:bCs/>
         </w:rPr>
         <w:t>oiminnot</w:t>
       </w:r>
@@ -290,7 +390,13 @@
         <w:rPr>
           <w:rFonts w:ascii="Arial" w:hAnsi="Arial" w:cs="Arial"/>
         </w:rPr>
-        <w:t>Lisää tuotteet</w:t>
+        <w:t>Lisää tuott</w:t>
+      </w:r>
+      <w:r>
+        <w:rPr>
+          <w:rFonts w:ascii="Arial" w:hAnsi="Arial" w:cs="Arial"/>
+        </w:rPr>
+        <w:t>eita</w:t>
       </w:r>
     </w:p>
     <w:p>
@@ -309,7 +415,13 @@
         <w:rPr>
           <w:rFonts w:ascii="Arial" w:hAnsi="Arial" w:cs="Arial"/>
         </w:rPr>
-        <w:t>Poista tuotteet</w:t>
+        <w:t xml:space="preserve">Poista </w:t>
+      </w:r>
+      <w:r>
+        <w:rPr>
+          <w:rFonts w:ascii="Arial" w:hAnsi="Arial" w:cs="Arial"/>
+        </w:rPr>
+        <w:t>tuotteita</w:t>
       </w:r>
     </w:p>
     <w:p>
@@ -328,7 +440,13 @@
         <w:rPr>
           <w:rFonts w:ascii="Arial" w:hAnsi="Arial" w:cs="Arial"/>
         </w:rPr>
-        <w:t>Päivitä tuotteet</w:t>
+        <w:t xml:space="preserve">Päivitä </w:t>
+      </w:r>
+      <w:r>
+        <w:rPr>
+          <w:rFonts w:ascii="Arial" w:hAnsi="Arial" w:cs="Arial"/>
+        </w:rPr>
+        <w:t>tuotteita</w:t>
       </w:r>
     </w:p>
     <w:p>
@@ -362,6 +480,7 @@
       <w:r>
         <w:rPr>
           <w:rFonts w:ascii="Arial" w:hAnsi="Arial" w:cs="Arial"/>
+          <w:noProof/>
         </w:rPr>
         <w:drawing>
           <wp:inline distT="0" distB="0" distL="0" distR="0" wp14:anchorId="34D97415" wp14:editId="591822BD">
@@ -403,23 +522,39 @@
     <w:p>
       <w:pPr>
         <w:pStyle w:val="Luettelokappale"/>
+        <w:ind w:left="1080"/>
+        <w:jc w:val="both"/>
+        <w:rPr>
+          <w:rFonts w:ascii="Arial" w:hAnsi="Arial" w:cs="Arial"/>
+        </w:rPr>
+      </w:pPr>
+    </w:p>
+    <w:p>
+      <w:pPr>
+        <w:pStyle w:val="Luettelokappale"/>
         <w:numPr>
           <w:ilvl w:val="0"/>
           <w:numId w:val="4"/>
         </w:numPr>
         <w:rPr>
           <w:rFonts w:ascii="Arial" w:hAnsi="Arial" w:cs="Arial"/>
-        </w:rPr>
-      </w:pPr>
-      <w:r>
-        <w:rPr>
-          <w:rFonts w:ascii="Arial" w:hAnsi="Arial" w:cs="Arial"/>
+          <w:b/>
+          <w:bCs/>
+        </w:rPr>
+      </w:pPr>
+      <w:r>
+        <w:rPr>
+          <w:rFonts w:ascii="Arial" w:hAnsi="Arial" w:cs="Arial"/>
+          <w:b/>
+          <w:bCs/>
         </w:rPr>
         <w:t xml:space="preserve"> </w:t>
       </w:r>
       <w:r>
         <w:rPr>
           <w:rFonts w:ascii="Arial" w:hAnsi="Arial" w:cs="Arial"/>
+          <w:b/>
+          <w:bCs/>
         </w:rPr>
         <w:t xml:space="preserve">Tietokanta </w:t>
       </w:r>
@@ -430,41 +565,48 @@
         <w:jc w:val="both"/>
         <w:rPr>
           <w:rFonts w:ascii="Arial" w:hAnsi="Arial" w:cs="Arial"/>
-        </w:rPr>
-      </w:pPr>
-      <w:r>
-        <w:rPr>
-          <w:rFonts w:ascii="Arial" w:hAnsi="Arial" w:cs="Arial"/>
+          <w:lang w:val="en-US"/>
+        </w:rPr>
+      </w:pPr>
+      <w:r>
+        <w:rPr>
+          <w:rFonts w:ascii="Arial" w:hAnsi="Arial" w:cs="Arial"/>
+          <w:lang w:val="en-US"/>
         </w:rPr>
         <w:t xml:space="preserve"> </w:t>
       </w:r>
       <w:r>
         <w:rPr>
           <w:rFonts w:ascii="Arial" w:hAnsi="Arial" w:cs="Arial"/>
+          <w:lang w:val="en-US"/>
         </w:rPr>
         <w:t xml:space="preserve"> </w:t>
       </w:r>
       <w:r>
         <w:rPr>
           <w:rFonts w:ascii="Arial" w:hAnsi="Arial" w:cs="Arial"/>
+          <w:lang w:val="en-US"/>
         </w:rPr>
         <w:t>DB-Browser</w:t>
       </w:r>
       <w:r>
         <w:rPr>
           <w:rFonts w:ascii="Arial" w:hAnsi="Arial" w:cs="Arial"/>
+          <w:lang w:val="en-US"/>
         </w:rPr>
         <w:t xml:space="preserve"> </w:t>
       </w:r>
       <w:r>
         <w:rPr>
           <w:rFonts w:ascii="Arial" w:hAnsi="Arial" w:cs="Arial"/>
+          <w:lang w:val="en-US"/>
         </w:rPr>
         <w:t>(</w:t>
       </w:r>
       <w:r>
         <w:rPr>
           <w:rFonts w:ascii="Arial" w:hAnsi="Arial" w:cs="Arial"/>
+          <w:lang w:val="en-US"/>
         </w:rPr>
         <w:t xml:space="preserve">products </w:t>
       </w:r>
@@ -477,44 +619,58 @@
       <w:r>
         <w:rPr>
           <w:rFonts w:ascii="Arial" w:hAnsi="Arial" w:cs="Arial"/>
+          <w:lang w:val="en-US"/>
         </w:rPr>
         <w:t>id,</w:t>
       </w:r>
       <w:r>
         <w:rPr>
           <w:rFonts w:ascii="Arial" w:hAnsi="Arial" w:cs="Arial"/>
+          <w:lang w:val="en-US"/>
         </w:rPr>
         <w:t xml:space="preserve"> </w:t>
       </w:r>
       <w:r>
         <w:rPr>
           <w:rFonts w:ascii="Arial" w:hAnsi="Arial" w:cs="Arial"/>
+          <w:lang w:val="en-US"/>
         </w:rPr>
         <w:t>nimi,</w:t>
       </w:r>
       <w:r>
         <w:rPr>
           <w:rFonts w:ascii="Arial" w:hAnsi="Arial" w:cs="Arial"/>
+          <w:lang w:val="en-US"/>
         </w:rPr>
         <w:t xml:space="preserve"> </w:t>
       </w:r>
       <w:r>
         <w:rPr>
           <w:rFonts w:ascii="Arial" w:hAnsi="Arial" w:cs="Arial"/>
+          <w:lang w:val="en-US"/>
         </w:rPr>
         <w:t>hinta,</w:t>
       </w:r>
       <w:r>
         <w:rPr>
           <w:rFonts w:ascii="Arial" w:hAnsi="Arial" w:cs="Arial"/>
+          <w:lang w:val="en-US"/>
         </w:rPr>
         <w:t xml:space="preserve"> </w:t>
       </w:r>
       <w:r>
         <w:rPr>
           <w:rFonts w:ascii="Arial" w:hAnsi="Arial" w:cs="Arial"/>
+          <w:lang w:val="en-US"/>
         </w:rPr>
         <w:t>määrä</w:t>
+      </w:r>
+      <w:r>
+        <w:rPr>
+          <w:rFonts w:ascii="Arial" w:hAnsi="Arial" w:cs="Arial"/>
+          <w:lang w:val="en-US"/>
+        </w:rPr>
+        <w:t>)</w:t>
       </w:r>
     </w:p>
     <w:p>
@@ -528,6 +684,7 @@
       <w:r>
         <w:rPr>
           <w:rFonts w:ascii="Arial" w:hAnsi="Arial" w:cs="Arial"/>
+          <w:noProof/>
         </w:rPr>
         <w:drawing>
           <wp:inline distT="0" distB="0" distL="0" distR="0" wp14:anchorId="14F193E0" wp14:editId="12C2AC3A">
@@ -575,12 +732,17 @@
         </w:numPr>
         <w:rPr>
           <w:rFonts w:ascii="Arial" w:hAnsi="Arial" w:cs="Arial"/>
-        </w:rPr>
-      </w:pPr>
-      <w:r>
-        <w:rPr>
-          <w:rFonts w:ascii="Arial" w:hAnsi="Arial" w:cs="Arial"/>
-        </w:rPr>
+          <w:b/>
+          <w:bCs/>
+        </w:rPr>
+      </w:pPr>
+      <w:r>
+        <w:rPr>
+          <w:rFonts w:ascii="Arial" w:hAnsi="Arial" w:cs="Arial"/>
+          <w:b/>
+          <w:bCs/>
+        </w:rPr>
+        <w:lastRenderedPageBreak/>
         <w:t xml:space="preserve"> Käyttö</w:t>
       </w:r>
     </w:p>
@@ -599,20 +761,67 @@
         <w:rPr>
           <w:rFonts w:ascii="Arial" w:hAnsi="Arial" w:cs="Arial"/>
         </w:rPr>
-        <w:lastRenderedPageBreak/>
         <w:t xml:space="preserve">   </w:t>
       </w:r>
       <w:r>
         <w:rPr>
           <w:rFonts w:ascii="Arial" w:hAnsi="Arial" w:cs="Arial"/>
         </w:rPr>
-        <w:t xml:space="preserve">Käyttäjä voivat komentoja terminaalissa ja </w:t>
-      </w:r>
-      <w:r>
-        <w:rPr>
-          <w:rFonts w:ascii="Arial" w:hAnsi="Arial" w:cs="Arial"/>
-        </w:rPr>
-        <w:t xml:space="preserve">lisää ja muokkaa </w:t>
+        <w:t>Käyttäjä voivat</w:t>
+      </w:r>
+      <w:r>
+        <w:rPr>
+          <w:rFonts w:ascii="Arial" w:hAnsi="Arial" w:cs="Arial"/>
+        </w:rPr>
+        <w:t xml:space="preserve"> kirjoittaa</w:t>
+      </w:r>
+      <w:r>
+        <w:rPr>
+          <w:rFonts w:ascii="Arial" w:hAnsi="Arial" w:cs="Arial"/>
+        </w:rPr>
+        <w:t xml:space="preserve"> komentoja terminaalissa </w:t>
+      </w:r>
+      <w:r>
+        <w:rPr>
+          <w:rFonts w:ascii="Arial" w:hAnsi="Arial" w:cs="Arial"/>
+        </w:rPr>
+        <w:t>sekä</w:t>
+      </w:r>
+      <w:r>
+        <w:rPr>
+          <w:rFonts w:ascii="Arial" w:hAnsi="Arial" w:cs="Arial"/>
+        </w:rPr>
+        <w:t xml:space="preserve"> </w:t>
+      </w:r>
+      <w:r>
+        <w:rPr>
+          <w:rFonts w:ascii="Arial" w:hAnsi="Arial" w:cs="Arial"/>
+        </w:rPr>
+        <w:t>lisä</w:t>
+      </w:r>
+      <w:r>
+        <w:rPr>
+          <w:rFonts w:ascii="Arial" w:hAnsi="Arial" w:cs="Arial"/>
+        </w:rPr>
+        <w:t>t</w:t>
+      </w:r>
+      <w:r>
+        <w:rPr>
+          <w:rFonts w:ascii="Arial" w:hAnsi="Arial" w:cs="Arial"/>
+        </w:rPr>
+        <w:t>ä ja muok</w:t>
+      </w:r>
+      <w:r>
+        <w:rPr>
+          <w:rFonts w:ascii="Arial" w:hAnsi="Arial" w:cs="Arial"/>
+        </w:rPr>
+        <w:t>ata tuotteita</w:t>
+      </w:r>
+      <w:r>
+        <w:rPr>
+          <w:rFonts w:ascii="Arial" w:hAnsi="Arial" w:cs="Arial"/>
+        </w:rPr>
+        <w:t xml:space="preserve"> </w:t>
       </w:r>
       <w:r>
         <w:rPr>
@@ -632,6 +841,18 @@
         </w:rPr>
         <w:t>issa.</w:t>
       </w:r>
+    </w:p>
+    <w:p>
+      <w:pPr>
+        <w:tabs>
+          <w:tab w:val="left" w:pos="426"/>
+        </w:tabs>
+        <w:ind w:left="284"/>
+        <w:jc w:val="both"/>
+        <w:rPr>
+          <w:rFonts w:ascii="Arial" w:hAnsi="Arial" w:cs="Arial"/>
+        </w:rPr>
+      </w:pPr>
     </w:p>
     <w:p>
       <w:pPr>
@@ -642,11 +863,15 @@
         </w:numPr>
         <w:rPr>
           <w:rFonts w:ascii="Arial" w:hAnsi="Arial" w:cs="Arial"/>
-        </w:rPr>
-      </w:pPr>
-      <w:r>
-        <w:rPr>
-          <w:rFonts w:ascii="Arial" w:hAnsi="Arial" w:cs="Arial"/>
+          <w:b/>
+          <w:bCs/>
+        </w:rPr>
+      </w:pPr>
+      <w:r>
+        <w:rPr>
+          <w:rFonts w:ascii="Arial" w:hAnsi="Arial" w:cs="Arial"/>
+          <w:b/>
+          <w:bCs/>
         </w:rPr>
         <w:t>Virheet</w:t>
       </w:r>
@@ -667,13 +892,7 @@
         <w:rPr>
           <w:rFonts w:ascii="Arial" w:hAnsi="Arial" w:cs="Arial"/>
         </w:rPr>
-        <w:t>K</w:t>
-      </w:r>
-      <w:r>
-        <w:rPr>
-          <w:rFonts w:ascii="Arial" w:hAnsi="Arial" w:cs="Arial"/>
-        </w:rPr>
-        <w:t>un lisääminen tuotteet terminaalista otettiin (string) myös hinnaksi.</w:t>
+        <w:t>Kun lisääminen tuotteet terminaalista otettiin (string) myös hinnaksi.</w:t>
       </w:r>
     </w:p>
     <w:p>
@@ -692,13 +911,7 @@
         <w:rPr>
           <w:rFonts w:ascii="Arial" w:hAnsi="Arial" w:cs="Arial"/>
         </w:rPr>
-        <w:t>K</w:t>
-      </w:r>
-      <w:r>
-        <w:rPr>
-          <w:rFonts w:ascii="Arial" w:hAnsi="Arial" w:cs="Arial"/>
-        </w:rPr>
-        <w:t>un lisääminen tuotteet terminaalista ja DB-Browseri otettiin negatiivinen hinta ja määrä.</w:t>
+        <w:t>Kun lisääminen tuotteet terminaalista ja DB-Browseri otettiin negatiivinen hinta ja määrä.</w:t>
       </w:r>
     </w:p>
     <w:p>
@@ -717,13 +930,7 @@
         <w:rPr>
           <w:rFonts w:ascii="Arial" w:hAnsi="Arial" w:cs="Arial"/>
         </w:rPr>
-        <w:t>K</w:t>
-      </w:r>
-      <w:r>
-        <w:rPr>
-          <w:rFonts w:ascii="Arial" w:hAnsi="Arial" w:cs="Arial"/>
-        </w:rPr>
-        <w:t>un valitaan numerolla päivitettävän tuotteen luokka, otettiin myös muut numerot ja merkkijonoarvoja.</w:t>
+        <w:t>Kun valitaan numerolla päivitettävän tuotteen luokka, otettiin myös muut numerot ja merkkijonoarvoja.</w:t>
       </w:r>
     </w:p>
     <w:p>

</xml_diff>

<commit_message>
my local changes before pulling
</commit_message>
<xml_diff>
--- a/Design Document.docx
+++ b/Design Document.docx
@@ -362,6 +362,7 @@
       <w:r>
         <w:rPr>
           <w:rFonts w:ascii="Arial" w:hAnsi="Arial" w:cs="Arial"/>
+          <w:noProof/>
         </w:rPr>
         <w:drawing>
           <wp:inline distT="0" distB="0" distL="0" distR="0" wp14:anchorId="34D97415" wp14:editId="591822BD">
@@ -528,6 +529,7 @@
       <w:r>
         <w:rPr>
           <w:rFonts w:ascii="Arial" w:hAnsi="Arial" w:cs="Arial"/>
+          <w:noProof/>
         </w:rPr>
         <w:drawing>
           <wp:inline distT="0" distB="0" distL="0" distR="0" wp14:anchorId="14F193E0" wp14:editId="12C2AC3A">
@@ -667,13 +669,7 @@
         <w:rPr>
           <w:rFonts w:ascii="Arial" w:hAnsi="Arial" w:cs="Arial"/>
         </w:rPr>
-        <w:t>K</w:t>
-      </w:r>
-      <w:r>
-        <w:rPr>
-          <w:rFonts w:ascii="Arial" w:hAnsi="Arial" w:cs="Arial"/>
-        </w:rPr>
-        <w:t>un lisääminen tuotteet terminaalista otettiin (string) myös hinnaksi.</w:t>
+        <w:t>Kun lisääminen tuotteet terminaalista otettiin (string) myös hinnaksi.</w:t>
       </w:r>
     </w:p>
     <w:p>
@@ -692,13 +688,7 @@
         <w:rPr>
           <w:rFonts w:ascii="Arial" w:hAnsi="Arial" w:cs="Arial"/>
         </w:rPr>
-        <w:t>K</w:t>
-      </w:r>
-      <w:r>
-        <w:rPr>
-          <w:rFonts w:ascii="Arial" w:hAnsi="Arial" w:cs="Arial"/>
-        </w:rPr>
-        <w:t>un lisääminen tuotteet terminaalista ja DB-Browseri otettiin negatiivinen hinta ja määrä.</w:t>
+        <w:t>Kun lisääminen tuotteet terminaalista ja DB-Browseri otettiin negatiivinen hinta ja määrä.</w:t>
       </w:r>
     </w:p>
     <w:p>
@@ -717,13 +707,7 @@
         <w:rPr>
           <w:rFonts w:ascii="Arial" w:hAnsi="Arial" w:cs="Arial"/>
         </w:rPr>
-        <w:t>K</w:t>
-      </w:r>
-      <w:r>
-        <w:rPr>
-          <w:rFonts w:ascii="Arial" w:hAnsi="Arial" w:cs="Arial"/>
-        </w:rPr>
-        <w:t>un valitaan numerolla päivitettävän tuotteen luokka, otettiin myös muut numerot ja merkkijonoarvoja.</w:t>
+        <w:t>Kun valitaan numerolla päivitettävän tuotteen luokka, otettiin myös muut numerot ja merkkijonoarvoja.</w:t>
       </w:r>
     </w:p>
     <w:p>

</xml_diff>